<commit_message>
horeca start laatste project p4
</commit_message>
<xml_diff>
--- a/Periode4/horeca/T4_PRA_PP_Horeca.docx
+++ b/Periode4/horeca/T4_PRA_PP_Horeca.docx
@@ -3684,7 +3684,10 @@
               <w:pStyle w:val="Paragraaf"/>
             </w:pPr>
             <w:r>
-              <w:t>19/19</w:t>
+              <w:t>19/</w:t>
+            </w:r>
+            <w:r>
+              <w:t>12</w:t>
             </w:r>
           </w:p>
         </w:tc>
@@ -3706,6 +3709,9 @@
             <w:pPr>
               <w:pStyle w:val="Paragraaf"/>
             </w:pPr>
+            <w:r>
+              <w:t>16/01</w:t>
+            </w:r>
           </w:p>
         </w:tc>
         <w:tc>
@@ -3764,6 +3770,9 @@
             <w:pPr>
               <w:pStyle w:val="Paragraaf"/>
             </w:pPr>
+            <w:r>
+              <w:t>16/01</w:t>
+            </w:r>
           </w:p>
         </w:tc>
         <w:tc>
@@ -3784,6 +3793,9 @@
             <w:pPr>
               <w:pStyle w:val="Paragraaf"/>
             </w:pPr>
+            <w:r>
+              <w:t>20/01</w:t>
+            </w:r>
           </w:p>
         </w:tc>
         <w:tc>
@@ -3842,7 +3854,7 @@
         <w:gridCol w:w="911"/>
         <w:gridCol w:w="911"/>
         <w:gridCol w:w="904"/>
-        <w:gridCol w:w="769"/>
+        <w:gridCol w:w="786"/>
         <w:gridCol w:w="740"/>
         <w:gridCol w:w="2711"/>
       </w:tblGrid>
@@ -4038,6 +4050,9 @@
             <w:pPr>
               <w:pStyle w:val="Paragraaf"/>
             </w:pPr>
+            <w:r>
+              <w:t>02/12</w:t>
+            </w:r>
           </w:p>
         </w:tc>
         <w:tc>
@@ -4058,6 +4073,9 @@
             <w:pPr>
               <w:pStyle w:val="Paragraaf"/>
             </w:pPr>
+            <w:r>
+              <w:t>08/12</w:t>
+            </w:r>
           </w:p>
         </w:tc>
         <w:tc>
@@ -4116,6 +4134,9 @@
             <w:pPr>
               <w:pStyle w:val="Paragraaf"/>
             </w:pPr>
+            <w:r>
+              <w:t>09/12</w:t>
+            </w:r>
           </w:p>
         </w:tc>
         <w:tc>
@@ -4136,6 +4157,9 @@
             <w:pPr>
               <w:pStyle w:val="Paragraaf"/>
             </w:pPr>
+            <w:r>
+              <w:t>09/12</w:t>
+            </w:r>
           </w:p>
         </w:tc>
         <w:tc>
@@ -4194,6 +4218,9 @@
             <w:pPr>
               <w:pStyle w:val="Paragraaf"/>
             </w:pPr>
+            <w:r>
+              <w:t>12/12</w:t>
+            </w:r>
           </w:p>
         </w:tc>
         <w:tc>
@@ -4204,6 +4231,9 @@
             <w:pPr>
               <w:pStyle w:val="Paragraaf"/>
             </w:pPr>
+            <w:r>
+              <w:t>13.15</w:t>
+            </w:r>
           </w:p>
         </w:tc>
         <w:tc>
@@ -4214,6 +4244,9 @@
             <w:pPr>
               <w:pStyle w:val="Paragraaf"/>
             </w:pPr>
+            <w:r>
+              <w:t>12/12</w:t>
+            </w:r>
           </w:p>
         </w:tc>
         <w:tc>
@@ -4224,6 +4257,9 @@
             <w:pPr>
               <w:pStyle w:val="Paragraaf"/>
             </w:pPr>
+            <w:r>
+              <w:t>14.15</w:t>
+            </w:r>
           </w:p>
         </w:tc>
         <w:tc>
@@ -4272,6 +4308,9 @@
             <w:pPr>
               <w:pStyle w:val="Paragraaf"/>
             </w:pPr>
+            <w:r>
+              <w:t>12/12</w:t>
+            </w:r>
           </w:p>
         </w:tc>
         <w:tc>
@@ -4282,6 +4321,9 @@
             <w:pPr>
               <w:pStyle w:val="Paragraaf"/>
             </w:pPr>
+            <w:r>
+              <w:t>14.15</w:t>
+            </w:r>
           </w:p>
         </w:tc>
         <w:tc>
@@ -4292,6 +4334,9 @@
             <w:pPr>
               <w:pStyle w:val="Paragraaf"/>
             </w:pPr>
+            <w:r>
+              <w:t>12/12</w:t>
+            </w:r>
           </w:p>
         </w:tc>
         <w:tc>
@@ -4302,6 +4347,9 @@
             <w:pPr>
               <w:pStyle w:val="Paragraaf"/>
             </w:pPr>
+            <w:r>
+              <w:t>15.15</w:t>
+            </w:r>
           </w:p>
         </w:tc>
         <w:tc>
@@ -4350,6 +4398,9 @@
             <w:pPr>
               <w:pStyle w:val="Paragraaf"/>
             </w:pPr>
+            <w:r>
+              <w:t>16/12</w:t>
+            </w:r>
           </w:p>
         </w:tc>
         <w:tc>
@@ -4360,6 +4411,9 @@
             <w:pPr>
               <w:pStyle w:val="Paragraaf"/>
             </w:pPr>
+            <w:r>
+              <w:t>13.15</w:t>
+            </w:r>
           </w:p>
         </w:tc>
         <w:tc>
@@ -4370,6 +4424,9 @@
             <w:pPr>
               <w:pStyle w:val="Paragraaf"/>
             </w:pPr>
+            <w:r>
+              <w:t>16/12</w:t>
+            </w:r>
           </w:p>
         </w:tc>
         <w:tc>
@@ -4380,6 +4437,9 @@
             <w:pPr>
               <w:pStyle w:val="Paragraaf"/>
             </w:pPr>
+            <w:r>
+              <w:t>14.15</w:t>
+            </w:r>
           </w:p>
         </w:tc>
         <w:tc>
@@ -4624,6 +4684,9 @@
             <w:pPr>
               <w:pStyle w:val="Paragraaf"/>
             </w:pPr>
+            <w:r>
+              <w:t>19/12</w:t>
+            </w:r>
           </w:p>
         </w:tc>
         <w:tc>
@@ -4644,6 +4707,9 @@
             <w:pPr>
               <w:pStyle w:val="Paragraaf"/>
             </w:pPr>
+            <w:r>
+              <w:t>19/12</w:t>
+            </w:r>
           </w:p>
         </w:tc>
         <w:tc>

</xml_diff>